<commit_message>
feat(portfolio): centralize contact links and update handles
Move resume, LinkedIn, GitHub, and email into a shared links module and use
it across the navbar, hero, and footer. Update the GitHub handle and live
demo URLs to the new domains, add a GitHub icon to the navbar and a GitHub
button to the mobile menu, and add the GameLead Radar preview image and
source link. Refresh the resume files.

Co-Authored-By: Claude Opus 5 <noreply@anthropic.com>
</commit_message>
<xml_diff>
--- a/public/assets/Jirald_Calusay_Resume.docx
+++ b/public/assets/Jirald_Calusay_Resume.docx
@@ -6,12 +6,12 @@
       <w:pPr>
         <w:spacing w:after="0" w:lineRule="auto"/>
         <w:rPr>
-          <w:rFonts w:ascii="Roboto ExtraBold" w:cs="Roboto ExtraBold" w:eastAsia="Roboto ExtraBold" w:hAnsi="Roboto ExtraBold"/>
-        </w:rPr>
-      </w:pPr>
-      <w:r>
-        <w:rPr>
-          <w:rFonts w:ascii="Roboto ExtraBold" w:cs="Roboto ExtraBold" w:eastAsia="Roboto ExtraBold" w:hAnsi="Roboto ExtraBold"/>
+          <w:rFonts w:ascii="Inter ExtraBold" w:cs="Inter ExtraBold" w:eastAsia="Inter ExtraBold" w:hAnsi="Inter ExtraBold"/>
+        </w:rPr>
+      </w:pPr>
+      <w:r>
+        <w:rPr>
+          <w:rFonts w:ascii="Inter ExtraBold" w:cs="Inter ExtraBold" w:eastAsia="Inter ExtraBold" w:hAnsi="Inter ExtraBold"/>
           <w:color w:val="1e3a5f"/>
           <w:sz w:val="32"/>
           <w:szCs w:val="32"/>
@@ -157,7 +157,7 @@
             <w:u w:val="single"/>
             <w:rtl w:val="0"/>
           </w:rPr>
-          <w:t xml:space="preserve">jiraldcalusay.vercel.app</w:t>
+          <w:t xml:space="preserve">jiraldcalusay.com</w:t>
         </w:r>
       </w:hyperlink>
       <w:r>
@@ -180,7 +180,7 @@
             <w:u w:val="single"/>
             <w:rtl w:val="0"/>
           </w:rPr>
-          <w:t xml:space="preserve">github.com/JiraldLaurea</w:t>
+          <w:t xml:space="preserve">github.com/jiraldcalusay</w:t>
         </w:r>
       </w:hyperlink>
       <w:r>
@@ -618,7 +618,7 @@
           <w:vertAlign w:val="baseline"/>
           <w:rtl w:val="0"/>
         </w:rPr>
-        <w:t xml:space="preserve">Built its campaign setup (venues, bookable time slots with capacity, prizes with their own stock and win rates) and the prize draw behind it, preventing overbooked slots and double-redeemed vouchers when several customers confirm at once</w:t>
+        <w:t xml:space="preserve">Built its campaign setup and prize draw (venues, bookable slots with capacity, prizes with their own stock and win rates), plus a partner-wide loyalty-points system with monthly settlement and passwordless SMS sign-in</w:t>
       </w:r>
     </w:p>
     <w:p>
@@ -663,7 +663,7 @@
           <w:vertAlign w:val="baseline"/>
           <w:rtl w:val="0"/>
         </w:rPr>
-        <w:t xml:space="preserve">Built a loyalty points system shared across partner businesses: customers earn points on purchases and spend them in an in-app shop, with monthly statements settling what each partner owes or is owed</w:t>
+        <w:t xml:space="preserve">Built GameLead Radar, an AI lead-discovery platform that crawls game-industry news/RSS feeds to surface pre-launch opportunities and auto-sends scored outreach emails via SMTP</w:t>
       </w:r>
     </w:p>
     <w:p>
@@ -708,7 +708,7 @@
           <w:vertAlign w:val="baseline"/>
           <w:rtl w:val="0"/>
         </w:rPr>
-        <w:t xml:space="preserve">Added passwordless SMS sign-in and shipped the customer app in English, Korean, Chinese, and Japanese</w:t>
+        <w:t xml:space="preserve">Developed an internal AI SNS Manager generating platform-specific social drafts with a human-in-the-loop approve-before-publish workflow, plus a comment-to-DM voucher campaign integrated with Shopify</w:t>
       </w:r>
     </w:p>
     <w:p>
@@ -753,7 +753,55 @@
           <w:vertAlign w:val="baseline"/>
           <w:rtl w:val="0"/>
         </w:rPr>
-        <w:t xml:space="preserve">Built GameLead Radar, an AI lead-discovery platform that crawls game-industry news/RSS feeds to surface pre-launch opportunities and auto-sends scored outreach emails via SMTP</w:t>
+        <w:t xml:space="preserve">Shipped a native Android app (Kotlin, Jetpack Compose) to Google Play with CameraX recording and on-device highlight generation</w:t>
+      </w:r>
+    </w:p>
+    <w:p>
+      <w:pPr>
+        <w:spacing w:after="0" w:before="90" w:lineRule="auto"/>
+        <w:rPr>
+          <w:color w:val="000000"/>
+        </w:rPr>
+      </w:pPr>
+      <w:r>
+        <w:rPr>
+          <w:rFonts w:ascii="Inter" w:cs="Inter" w:eastAsia="Inter" w:hAnsi="Inter"/>
+          <w:b w:val="1"/>
+          <w:bCs w:val="1"/>
+          <w:color w:val="000000"/>
+          <w:sz w:val="18"/>
+          <w:szCs w:val="18"/>
+          <w:rtl w:val="0"/>
+        </w:rPr>
+        <w:t xml:space="preserve">Frontend / React Developer</w:t>
+      </w:r>
+      <w:r>
+        <w:rPr>
+          <w:rtl w:val="0"/>
+        </w:rPr>
+      </w:r>
+    </w:p>
+    <w:p>
+      <w:pPr>
+        <w:spacing w:after="30" w:lineRule="auto"/>
+        <w:rPr>
+          <w:color w:val="434343"/>
+        </w:rPr>
+      </w:pPr>
+      <w:r>
+        <w:rPr>
+          <w:rFonts w:ascii="Inter" w:cs="Inter" w:eastAsia="Inter" w:hAnsi="Inter"/>
+          <w:color w:val="434343"/>
+          <w:sz w:val="16"/>
+          <w:szCs w:val="16"/>
+          <w:rtl w:val="0"/>
+        </w:rPr>
+        <w:t xml:space="preserve">Advanced World Solutions, Inc. | Oct 2023 – Mar 2026</w:t>
+      </w:r>
+      <w:r>
+        <w:rPr>
+          <w:rtl w:val="0"/>
+        </w:rPr>
       </w:r>
     </w:p>
     <w:p>
@@ -798,7 +846,7 @@
           <w:vertAlign w:val="baseline"/>
           <w:rtl w:val="0"/>
         </w:rPr>
-        <w:t xml:space="preserve">Developed an internal AI SNS Manager generating platform-specific social drafts with a human-in-the-loop approve-before-publish workflow, plus a comment-to-DM voucher campaign integrated with Shopify</w:t>
+        <w:t xml:space="preserve">Developed and maintained enterprise web applications using React, TypeScript, Next.js, Node.js, and Material UI</w:t>
       </w:r>
     </w:p>
     <w:p>
@@ -843,55 +891,7 @@
           <w:vertAlign w:val="baseline"/>
           <w:rtl w:val="0"/>
         </w:rPr>
-        <w:t xml:space="preserve">Shipped a native Android app (Kotlin, Jetpack Compose) to Google Play with CameraX recording and on-device highlight generation</w:t>
-      </w:r>
-    </w:p>
-    <w:p>
-      <w:pPr>
-        <w:spacing w:after="0" w:before="90" w:lineRule="auto"/>
-        <w:rPr>
-          <w:color w:val="000000"/>
-        </w:rPr>
-      </w:pPr>
-      <w:r>
-        <w:rPr>
-          <w:rFonts w:ascii="Inter" w:cs="Inter" w:eastAsia="Inter" w:hAnsi="Inter"/>
-          <w:b w:val="1"/>
-          <w:bCs w:val="1"/>
-          <w:color w:val="000000"/>
-          <w:sz w:val="18"/>
-          <w:szCs w:val="18"/>
-          <w:rtl w:val="0"/>
-        </w:rPr>
-        <w:t xml:space="preserve">Frontend / React Developer</w:t>
-      </w:r>
-      <w:r>
-        <w:rPr>
-          <w:rtl w:val="0"/>
-        </w:rPr>
-      </w:r>
-    </w:p>
-    <w:p>
-      <w:pPr>
-        <w:spacing w:after="30" w:lineRule="auto"/>
-        <w:rPr>
-          <w:color w:val="434343"/>
-        </w:rPr>
-      </w:pPr>
-      <w:r>
-        <w:rPr>
-          <w:rFonts w:ascii="Inter" w:cs="Inter" w:eastAsia="Inter" w:hAnsi="Inter"/>
-          <w:color w:val="434343"/>
-          <w:sz w:val="16"/>
-          <w:szCs w:val="16"/>
-          <w:rtl w:val="0"/>
-        </w:rPr>
-        <w:t xml:space="preserve">Advanced World Solutions, Inc. | Oct 2023 – Mar 2026</w:t>
-      </w:r>
-      <w:r>
-        <w:rPr>
-          <w:rtl w:val="0"/>
-        </w:rPr>
+        <w:t xml:space="preserve">Built reusable UI components and integrated REST APIs backed by Node.js services</w:t>
       </w:r>
     </w:p>
     <w:p>
@@ -936,7 +936,55 @@
           <w:vertAlign w:val="baseline"/>
           <w:rtl w:val="0"/>
         </w:rPr>
-        <w:t xml:space="preserve">Developed and maintained enterprise web applications using React, TypeScript, Next.js, Node.js, and Material UI</w:t>
+        <w:t xml:space="preserve">Collaborated with offshore teams using GitHub/GitLab workflows, and investigated and resolved production issues to improve application stability</w:t>
+      </w:r>
+    </w:p>
+    <w:p>
+      <w:pPr>
+        <w:spacing w:after="0" w:before="90" w:lineRule="auto"/>
+        <w:rPr>
+          <w:color w:val="000000"/>
+        </w:rPr>
+      </w:pPr>
+      <w:r>
+        <w:rPr>
+          <w:rFonts w:ascii="Inter" w:cs="Inter" w:eastAsia="Inter" w:hAnsi="Inter"/>
+          <w:b w:val="1"/>
+          <w:bCs w:val="1"/>
+          <w:color w:val="000000"/>
+          <w:sz w:val="18"/>
+          <w:szCs w:val="18"/>
+          <w:rtl w:val="0"/>
+        </w:rPr>
+        <w:t xml:space="preserve">Fullstack Developer (OJT)</w:t>
+      </w:r>
+      <w:r>
+        <w:rPr>
+          <w:rtl w:val="0"/>
+        </w:rPr>
+      </w:r>
+    </w:p>
+    <w:p>
+      <w:pPr>
+        <w:spacing w:after="30" w:lineRule="auto"/>
+        <w:rPr>
+          <w:color w:val="434343"/>
+        </w:rPr>
+      </w:pPr>
+      <w:r>
+        <w:rPr>
+          <w:rFonts w:ascii="Inter" w:cs="Inter" w:eastAsia="Inter" w:hAnsi="Inter"/>
+          <w:color w:val="434343"/>
+          <w:sz w:val="16"/>
+          <w:szCs w:val="16"/>
+          <w:rtl w:val="0"/>
+        </w:rPr>
+        <w:t xml:space="preserve">General Services Office Iloilo | Feb 2023 – May 2023</w:t>
+      </w:r>
+      <w:r>
+        <w:rPr>
+          <w:rtl w:val="0"/>
+        </w:rPr>
       </w:r>
     </w:p>
     <w:p>
@@ -981,7 +1029,7 @@
           <w:vertAlign w:val="baseline"/>
           <w:rtl w:val="0"/>
         </w:rPr>
-        <w:t xml:space="preserve">Built reusable UI components and integrated REST APIs backed by Node.js services</w:t>
+        <w:t xml:space="preserve">Sole developer of a Barangay Solid Waste Management System built with React, Next.js, and an Express.js REST API</w:t>
       </w:r>
     </w:p>
     <w:p>
@@ -1026,27 +1074,54 @@
           <w:vertAlign w:val="baseline"/>
           <w:rtl w:val="0"/>
         </w:rPr>
-        <w:t xml:space="preserve">Collaborated with offshore teams using GitHub/GitLab workflows, and investigated and resolved production issues to improve application stability</w:t>
-      </w:r>
-    </w:p>
-    <w:p>
-      <w:pPr>
-        <w:spacing w:after="0" w:before="90" w:lineRule="auto"/>
-        <w:rPr>
-          <w:color w:val="000000"/>
-        </w:rPr>
+        <w:t xml:space="preserve">Designed the MySQL/Sequelize data model and implemented authentication, reporting, and data management features</w:t>
+      </w:r>
+    </w:p>
+    <w:p>
+      <w:pPr>
+        <w:pBdr>
+          <w:bottom w:color="b9c4d0" w:space="1" w:sz="6" w:val="single"/>
+        </w:pBdr>
+        <w:spacing w:after="60" w:before="150" w:lineRule="auto"/>
+        <w:rPr/>
       </w:pPr>
       <w:r>
         <w:rPr>
           <w:rFonts w:ascii="Inter" w:cs="Inter" w:eastAsia="Inter" w:hAnsi="Inter"/>
           <w:b w:val="1"/>
           <w:bCs w:val="1"/>
-          <w:color w:val="000000"/>
+          <w:smallCaps w:val="1"/>
+          <w:color w:val="1e3a5f"/>
           <w:sz w:val="18"/>
           <w:szCs w:val="18"/>
           <w:rtl w:val="0"/>
         </w:rPr>
-        <w:t xml:space="preserve">Fullstack Developer (OJT)</w:t>
+        <w:t xml:space="preserve">PROJECTS</w:t>
+      </w:r>
+      <w:r>
+        <w:rPr>
+          <w:rtl w:val="0"/>
+        </w:rPr>
+      </w:r>
+    </w:p>
+    <w:p>
+      <w:pPr>
+        <w:spacing w:after="0" w:before="90" w:lineRule="auto"/>
+        <w:rPr>
+          <w:color w:val="000000"/>
+        </w:rPr>
+      </w:pPr>
+      <w:r>
+        <w:rPr>
+          <w:rFonts w:ascii="Inter" w:cs="Inter" w:eastAsia="Inter" w:hAnsi="Inter"/>
+          <w:b w:val="1"/>
+          <w:bCs w:val="1"/>
+          <w:color w:val="000000"/>
+          <w:sz w:val="18"/>
+          <w:szCs w:val="18"/>
+          <w:rtl w:val="0"/>
+        </w:rPr>
+        <w:t xml:space="preserve">Voucher Hunt – Voucher Marketing Platform (Web + Android)</w:t>
       </w:r>
       <w:r>
         <w:rPr>
@@ -1057,20 +1132,64 @@
     <w:p>
       <w:pPr>
         <w:spacing w:after="30" w:lineRule="auto"/>
-        <w:rPr>
-          <w:color w:val="434343"/>
-        </w:rPr>
-      </w:pPr>
-      <w:r>
-        <w:rPr>
-          <w:rFonts w:ascii="Inter" w:cs="Inter" w:eastAsia="Inter" w:hAnsi="Inter"/>
-          <w:color w:val="434343"/>
-          <w:sz w:val="16"/>
-          <w:szCs w:val="16"/>
-          <w:rtl w:val="0"/>
-        </w:rPr>
-        <w:t xml:space="preserve">General Services Office Iloilo | Feb 2023 – May 2023</w:t>
-      </w:r>
+        <w:rPr/>
+      </w:pPr>
+      <w:hyperlink r:id="rId100">
+        <w:r>
+          <w:rPr>
+            <w:rFonts w:ascii="Inter" w:cs="Inter" w:eastAsia="Inter" w:hAnsi="Inter"/>
+            <w:color w:val="1155cc"/>
+            <w:sz w:val="16"/>
+            <w:szCs w:val="16"/>
+            <w:u w:val="single"/>
+            <w:rtl w:val="0"/>
+          </w:rPr>
+          <w:t xml:space="preserve">voucher-hunt.com</w:t>
+        </w:r>
+      </w:hyperlink>
+      <w:r>
+        <w:rPr>
+          <w:rFonts w:ascii="Inter" w:cs="Inter" w:eastAsia="Inter" w:hAnsi="Inter"/>
+          <w:color w:val="5a6672"/>
+          <w:sz w:val="16"/>
+          <w:szCs w:val="16"/>
+          <w:rtl w:val="0"/>
+        </w:rPr>
+        <w:t xml:space="preserve"> </w:t>
+      </w:r>
+      <w:r>
+        <w:rPr>
+          <w:rFonts w:ascii="Inter" w:cs="Inter" w:eastAsia="Inter" w:hAnsi="Inter"/>
+          <w:color w:val="000000"/>
+          <w:sz w:val="16"/>
+          <w:szCs w:val="16"/>
+          <w:rtl w:val="0"/>
+        </w:rPr>
+        <w:t xml:space="preserve">|</w:t>
+      </w:r>
+      <w:r>
+        <w:rPr>
+          <w:rFonts w:ascii="Inter" w:cs="Inter" w:eastAsia="Inter" w:hAnsi="Inter"/>
+          <w:color w:val="5a6672"/>
+          <w:sz w:val="16"/>
+          <w:szCs w:val="16"/>
+          <w:rtl w:val="0"/>
+        </w:rPr>
+        <w:t xml:space="preserve"> </w:t>
+      </w:r>
+      <w:hyperlink r:id="rId101">
+        <w:r>
+          <w:rPr>
+            <w:rFonts w:ascii="Inter" w:cs="Inter" w:eastAsia="Inter" w:hAnsi="Inter"/>
+            <w:color w:val="1155cc"/>
+            <w:sz w:val="16"/>
+            <w:szCs w:val="16"/>
+            <w:u w:val="single"/>
+            <w:rtl w:val="0"/>
+          </w:rPr>
+          <w:t xml:space="preserve">github.com/jiraldcalusay/bizflow-voucher-hunter</w:t>
+        </w:r>
+      </w:hyperlink>
       <w:r>
         <w:rPr>
           <w:rtl w:val="0"/>
@@ -1119,7 +1238,99 @@
           <w:vertAlign w:val="baseline"/>
           <w:rtl w:val="0"/>
         </w:rPr>
-        <w:t xml:space="preserve">Sole developer of a Barangay Solid Waste Management System built with React, Next.js, and an Express.js REST API</w:t>
+        <w:t xml:space="preserve">Built the platform end to end on Next.js, React, TypeScript, and PostgreSQL, and shipped its React Native / Expo customer app to Google Play in four languages</w:t>
+      </w:r>
+    </w:p>
+    <w:p>
+      <w:pPr>
+        <w:spacing w:after="0" w:before="90" w:lineRule="auto"/>
+        <w:rPr>
+          <w:color w:val="000000"/>
+        </w:rPr>
+      </w:pPr>
+      <w:r>
+        <w:rPr>
+          <w:rFonts w:ascii="Inter" w:cs="Inter" w:eastAsia="Inter" w:hAnsi="Inter"/>
+          <w:b w:val="1"/>
+          <w:bCs w:val="1"/>
+          <w:color w:val="000000"/>
+          <w:sz w:val="18"/>
+          <w:szCs w:val="18"/>
+          <w:rtl w:val="0"/>
+        </w:rPr>
+        <w:t xml:space="preserve">Kwarta – Personal Finance Web App</w:t>
+      </w:r>
+      <w:r>
+        <w:rPr>
+          <w:rtl w:val="0"/>
+        </w:rPr>
+      </w:r>
+    </w:p>
+    <w:p>
+      <w:pPr>
+        <w:spacing w:after="30" w:lineRule="auto"/>
+        <w:rPr/>
+      </w:pPr>
+      <w:hyperlink r:id="rId10">
+        <w:r>
+          <w:rPr>
+            <w:rFonts w:ascii="Inter" w:cs="Inter" w:eastAsia="Inter" w:hAnsi="Inter"/>
+            <w:color w:val="1155cc"/>
+            <w:sz w:val="16"/>
+            <w:szCs w:val="16"/>
+            <w:u w:val="single"/>
+            <w:rtl w:val="0"/>
+          </w:rPr>
+          <w:t xml:space="preserve">kwarta.vercel.app</w:t>
+        </w:r>
+      </w:hyperlink>
+      <w:r>
+        <w:rPr>
+          <w:rFonts w:ascii="Inter" w:cs="Inter" w:eastAsia="Inter" w:hAnsi="Inter"/>
+          <w:color w:val="5a6672"/>
+          <w:sz w:val="16"/>
+          <w:szCs w:val="16"/>
+          <w:rtl w:val="0"/>
+        </w:rPr>
+        <w:t xml:space="preserve"> </w:t>
+      </w:r>
+      <w:r>
+        <w:rPr>
+          <w:rFonts w:ascii="Inter" w:cs="Inter" w:eastAsia="Inter" w:hAnsi="Inter"/>
+          <w:color w:val="000000"/>
+          <w:sz w:val="16"/>
+          <w:szCs w:val="16"/>
+          <w:rtl w:val="0"/>
+        </w:rPr>
+        <w:t xml:space="preserve">|</w:t>
+      </w:r>
+      <w:r>
+        <w:rPr>
+          <w:rFonts w:ascii="Inter" w:cs="Inter" w:eastAsia="Inter" w:hAnsi="Inter"/>
+          <w:color w:val="5a6672"/>
+          <w:sz w:val="16"/>
+          <w:szCs w:val="16"/>
+          <w:rtl w:val="0"/>
+        </w:rPr>
+        <w:t xml:space="preserve"> </w:t>
+      </w:r>
+      <w:hyperlink r:id="rId11">
+        <w:r>
+          <w:rPr>
+            <w:rFonts w:ascii="Inter" w:cs="Inter" w:eastAsia="Inter" w:hAnsi="Inter"/>
+            <w:color w:val="1155cc"/>
+            <w:sz w:val="16"/>
+            <w:szCs w:val="16"/>
+            <w:u w:val="single"/>
+            <w:rtl w:val="0"/>
+          </w:rPr>
+          <w:t xml:space="preserve">github.com/jiraldcalusay/kwarta</w:t>
+        </w:r>
+      </w:hyperlink>
+      <w:r>
+        <w:rPr>
+          <w:rtl w:val="0"/>
+        </w:rPr>
       </w:r>
     </w:p>
     <w:p>
@@ -1164,126 +1375,7 @@
           <w:vertAlign w:val="baseline"/>
           <w:rtl w:val="0"/>
         </w:rPr>
-        <w:t xml:space="preserve">Designed the MySQL/Sequelize data model and implemented authentication, reporting, and data management features</w:t>
-      </w:r>
-    </w:p>
-    <w:p>
-      <w:pPr>
-        <w:pBdr>
-          <w:bottom w:color="b9c4d0" w:space="1" w:sz="6" w:val="single"/>
-        </w:pBdr>
-        <w:spacing w:after="60" w:before="150" w:lineRule="auto"/>
-        <w:rPr/>
-      </w:pPr>
-      <w:r>
-        <w:rPr>
-          <w:rFonts w:ascii="Inter" w:cs="Inter" w:eastAsia="Inter" w:hAnsi="Inter"/>
-          <w:b w:val="1"/>
-          <w:bCs w:val="1"/>
-          <w:smallCaps w:val="1"/>
-          <w:color w:val="1e3a5f"/>
-          <w:sz w:val="18"/>
-          <w:szCs w:val="18"/>
-          <w:rtl w:val="0"/>
-        </w:rPr>
-        <w:t xml:space="preserve">PROJECTS</w:t>
-      </w:r>
-      <w:r>
-        <w:rPr>
-          <w:rtl w:val="0"/>
-        </w:rPr>
-      </w:r>
-    </w:p>
-    <w:p>
-      <w:pPr>
-        <w:spacing w:after="0" w:before="90" w:lineRule="auto"/>
-        <w:rPr>
-          <w:color w:val="000000"/>
-        </w:rPr>
-      </w:pPr>
-      <w:r>
-        <w:rPr>
-          <w:rFonts w:ascii="Inter" w:cs="Inter" w:eastAsia="Inter" w:hAnsi="Inter"/>
-          <w:b w:val="1"/>
-          <w:bCs w:val="1"/>
-          <w:color w:val="000000"/>
-          <w:sz w:val="18"/>
-          <w:szCs w:val="18"/>
-          <w:rtl w:val="0"/>
-        </w:rPr>
-        <w:t xml:space="preserve">Kwarta – Personal Finance Web App</w:t>
-      </w:r>
-      <w:r>
-        <w:rPr>
-          <w:rtl w:val="0"/>
-        </w:rPr>
-      </w:r>
-    </w:p>
-    <w:p>
-      <w:pPr>
-        <w:spacing w:after="30" w:lineRule="auto"/>
-        <w:rPr/>
-      </w:pPr>
-      <w:hyperlink r:id="rId10">
-        <w:r>
-          <w:rPr>
-            <w:rFonts w:ascii="Inter" w:cs="Inter" w:eastAsia="Inter" w:hAnsi="Inter"/>
-            <w:color w:val="1155cc"/>
-            <w:sz w:val="16"/>
-            <w:szCs w:val="16"/>
-            <w:u w:val="single"/>
-            <w:rtl w:val="0"/>
-          </w:rPr>
-          <w:t xml:space="preserve">kwarta.vercel.app</w:t>
-        </w:r>
-      </w:hyperlink>
-      <w:r>
-        <w:rPr>
-          <w:rFonts w:ascii="Inter" w:cs="Inter" w:eastAsia="Inter" w:hAnsi="Inter"/>
-          <w:color w:val="5a6672"/>
-          <w:sz w:val="16"/>
-          <w:szCs w:val="16"/>
-          <w:rtl w:val="0"/>
-        </w:rPr>
-        <w:t xml:space="preserve"> </w:t>
-      </w:r>
-      <w:r>
-        <w:rPr>
-          <w:rFonts w:ascii="Inter" w:cs="Inter" w:eastAsia="Inter" w:hAnsi="Inter"/>
-          <w:color w:val="000000"/>
-          <w:sz w:val="16"/>
-          <w:szCs w:val="16"/>
-          <w:rtl w:val="0"/>
-        </w:rPr>
-        <w:t xml:space="preserve">|</w:t>
-      </w:r>
-      <w:r>
-        <w:rPr>
-          <w:rFonts w:ascii="Inter" w:cs="Inter" w:eastAsia="Inter" w:hAnsi="Inter"/>
-          <w:color w:val="5a6672"/>
-          <w:sz w:val="16"/>
-          <w:szCs w:val="16"/>
-          <w:rtl w:val="0"/>
-        </w:rPr>
-        <w:t xml:space="preserve"> </w:t>
-      </w:r>
-      <w:hyperlink r:id="rId11">
-        <w:r>
-          <w:rPr>
-            <w:rFonts w:ascii="Inter" w:cs="Inter" w:eastAsia="Inter" w:hAnsi="Inter"/>
-            <w:color w:val="1155cc"/>
-            <w:sz w:val="16"/>
-            <w:szCs w:val="16"/>
-            <w:u w:val="single"/>
-            <w:rtl w:val="0"/>
-          </w:rPr>
-          <w:t xml:space="preserve">github.com/JiraldLaurea/kwarta</w:t>
-        </w:r>
-      </w:hyperlink>
-      <w:r>
-        <w:rPr>
-          <w:rtl w:val="0"/>
-        </w:rPr>
+        <w:t xml:space="preserve">Built a responsive personal finance app (Next.js App Router, React, TypeScript, Tailwind CSS) tracking income, expenses, budgets, accounts, and transfers with category-based limits</w:t>
       </w:r>
     </w:p>
     <w:p>
@@ -1328,7 +1420,99 @@
           <w:vertAlign w:val="baseline"/>
           <w:rtl w:val="0"/>
         </w:rPr>
-        <w:t xml:space="preserve">Built a responsive personal finance app (Next.js App Router, React, TypeScript, Tailwind CSS) tracking income, expenses, budgets, accounts, and transfers with category-based limits</w:t>
+        <w:t xml:space="preserve">Implemented reporting dashboards and backup &amp; restore over authenticated user workspaces, deployed on Vercel</w:t>
+      </w:r>
+    </w:p>
+    <w:p>
+      <w:pPr>
+        <w:spacing w:after="0" w:before="90" w:lineRule="auto"/>
+        <w:rPr>
+          <w:color w:val="000000"/>
+        </w:rPr>
+      </w:pPr>
+      <w:r>
+        <w:rPr>
+          <w:rFonts w:ascii="Inter" w:cs="Inter" w:eastAsia="Inter" w:hAnsi="Inter"/>
+          <w:b w:val="1"/>
+          <w:bCs w:val="1"/>
+          <w:color w:val="000000"/>
+          <w:sz w:val="18"/>
+          <w:szCs w:val="18"/>
+          <w:rtl w:val="0"/>
+        </w:rPr>
+        <w:t xml:space="preserve">Sellix – Full-Stack E-Commerce Platform</w:t>
+      </w:r>
+      <w:r>
+        <w:rPr>
+          <w:rtl w:val="0"/>
+        </w:rPr>
+      </w:r>
+    </w:p>
+    <w:p>
+      <w:pPr>
+        <w:spacing w:after="30" w:lineRule="auto"/>
+        <w:rPr/>
+      </w:pPr>
+      <w:hyperlink r:id="rId12">
+        <w:r>
+          <w:rPr>
+            <w:rFonts w:ascii="Inter" w:cs="Inter" w:eastAsia="Inter" w:hAnsi="Inter"/>
+            <w:color w:val="1155cc"/>
+            <w:sz w:val="16"/>
+            <w:szCs w:val="16"/>
+            <w:u w:val="single"/>
+            <w:rtl w:val="0"/>
+          </w:rPr>
+          <w:t xml:space="preserve">sellix-ecommerce.vercel.app</w:t>
+        </w:r>
+      </w:hyperlink>
+      <w:r>
+        <w:rPr>
+          <w:rFonts w:ascii="Inter" w:cs="Inter" w:eastAsia="Inter" w:hAnsi="Inter"/>
+          <w:color w:val="5a6672"/>
+          <w:sz w:val="16"/>
+          <w:szCs w:val="16"/>
+          <w:rtl w:val="0"/>
+        </w:rPr>
+        <w:t xml:space="preserve"> </w:t>
+      </w:r>
+      <w:r>
+        <w:rPr>
+          <w:rFonts w:ascii="Inter" w:cs="Inter" w:eastAsia="Inter" w:hAnsi="Inter"/>
+          <w:color w:val="000000"/>
+          <w:sz w:val="16"/>
+          <w:szCs w:val="16"/>
+          <w:rtl w:val="0"/>
+        </w:rPr>
+        <w:t xml:space="preserve">|</w:t>
+      </w:r>
+      <w:r>
+        <w:rPr>
+          <w:rFonts w:ascii="Inter" w:cs="Inter" w:eastAsia="Inter" w:hAnsi="Inter"/>
+          <w:color w:val="5a6672"/>
+          <w:sz w:val="16"/>
+          <w:szCs w:val="16"/>
+          <w:rtl w:val="0"/>
+        </w:rPr>
+        <w:t xml:space="preserve"> </w:t>
+      </w:r>
+      <w:hyperlink r:id="rId13">
+        <w:r>
+          <w:rPr>
+            <w:rFonts w:ascii="Inter" w:cs="Inter" w:eastAsia="Inter" w:hAnsi="Inter"/>
+            <w:color w:val="1155cc"/>
+            <w:sz w:val="16"/>
+            <w:szCs w:val="16"/>
+            <w:u w:val="single"/>
+            <w:rtl w:val="0"/>
+          </w:rPr>
+          <w:t xml:space="preserve">github.com/jiraldcalusay/sellix</w:t>
+        </w:r>
+      </w:hyperlink>
+      <w:r>
+        <w:rPr>
+          <w:rtl w:val="0"/>
+        </w:rPr>
       </w:r>
     </w:p>
     <w:p>
@@ -1373,99 +1557,7 @@
           <w:vertAlign w:val="baseline"/>
           <w:rtl w:val="0"/>
         </w:rPr>
-        <w:t xml:space="preserve">Implemented reporting dashboards and backup &amp; restore over authenticated user workspaces, deployed on Vercel</w:t>
-      </w:r>
-    </w:p>
-    <w:p>
-      <w:pPr>
-        <w:spacing w:after="0" w:before="90" w:lineRule="auto"/>
-        <w:rPr>
-          <w:color w:val="000000"/>
-        </w:rPr>
-      </w:pPr>
-      <w:r>
-        <w:rPr>
-          <w:rFonts w:ascii="Inter" w:cs="Inter" w:eastAsia="Inter" w:hAnsi="Inter"/>
-          <w:b w:val="1"/>
-          <w:bCs w:val="1"/>
-          <w:color w:val="000000"/>
-          <w:sz w:val="18"/>
-          <w:szCs w:val="18"/>
-          <w:rtl w:val="0"/>
-        </w:rPr>
-        <w:t xml:space="preserve">Sellix – Full-Stack E-Commerce Platform</w:t>
-      </w:r>
-      <w:r>
-        <w:rPr>
-          <w:rtl w:val="0"/>
-        </w:rPr>
-      </w:r>
-    </w:p>
-    <w:p>
-      <w:pPr>
-        <w:spacing w:after="30" w:lineRule="auto"/>
-        <w:rPr/>
-      </w:pPr>
-      <w:hyperlink r:id="rId12">
-        <w:r>
-          <w:rPr>
-            <w:rFonts w:ascii="Inter" w:cs="Inter" w:eastAsia="Inter" w:hAnsi="Inter"/>
-            <w:color w:val="1155cc"/>
-            <w:sz w:val="16"/>
-            <w:szCs w:val="16"/>
-            <w:u w:val="single"/>
-            <w:rtl w:val="0"/>
-          </w:rPr>
-          <w:t xml:space="preserve">sellix-ecommerce.vercel.app</w:t>
-        </w:r>
-      </w:hyperlink>
-      <w:r>
-        <w:rPr>
-          <w:rFonts w:ascii="Inter" w:cs="Inter" w:eastAsia="Inter" w:hAnsi="Inter"/>
-          <w:color w:val="5a6672"/>
-          <w:sz w:val="16"/>
-          <w:szCs w:val="16"/>
-          <w:rtl w:val="0"/>
-        </w:rPr>
-        <w:t xml:space="preserve"> </w:t>
-      </w:r>
-      <w:r>
-        <w:rPr>
-          <w:rFonts w:ascii="Inter" w:cs="Inter" w:eastAsia="Inter" w:hAnsi="Inter"/>
-          <w:color w:val="000000"/>
-          <w:sz w:val="16"/>
-          <w:szCs w:val="16"/>
-          <w:rtl w:val="0"/>
-        </w:rPr>
-        <w:t xml:space="preserve">|</w:t>
-      </w:r>
-      <w:r>
-        <w:rPr>
-          <w:rFonts w:ascii="Inter" w:cs="Inter" w:eastAsia="Inter" w:hAnsi="Inter"/>
-          <w:color w:val="5a6672"/>
-          <w:sz w:val="16"/>
-          <w:szCs w:val="16"/>
-          <w:rtl w:val="0"/>
-        </w:rPr>
-        <w:t xml:space="preserve"> </w:t>
-      </w:r>
-      <w:hyperlink r:id="rId13">
-        <w:r>
-          <w:rPr>
-            <w:rFonts w:ascii="Inter" w:cs="Inter" w:eastAsia="Inter" w:hAnsi="Inter"/>
-            <w:color w:val="1155cc"/>
-            <w:sz w:val="16"/>
-            <w:szCs w:val="16"/>
-            <w:u w:val="single"/>
-            <w:rtl w:val="0"/>
-          </w:rPr>
-          <w:t xml:space="preserve">github.com/JiraldLaurea/sellix</w:t>
-        </w:r>
-      </w:hyperlink>
-      <w:r>
-        <w:rPr>
-          <w:rtl w:val="0"/>
-        </w:rPr>
+        <w:t xml:space="preserve">Built a production-grade e-commerce platform (Next.js App Router, React, TypeScript) with add-to-cart, favorites, checkout, and order confirmation</w:t>
       </w:r>
     </w:p>
     <w:p>
@@ -1510,51 +1602,6 @@
           <w:vertAlign w:val="baseline"/>
           <w:rtl w:val="0"/>
         </w:rPr>
-        <w:t xml:space="preserve">Built a production-grade e-commerce platform (Next.js App Router, React, TypeScript) with add-to-cart, favorites, checkout, and order confirmation</w:t>
-      </w:r>
-    </w:p>
-    <w:p>
-      <w:pPr>
-        <w:keepNext w:val="0"/>
-        <w:keepLines w:val="0"/>
-        <w:pageBreakBefore w:val="0"/>
-        <w:widowControl w:val="1"/>
-        <w:numPr>
-          <w:ilvl w:val="0"/>
-          <w:numId w:val="1"/>
-        </w:numPr>
-        <w:pBdr>
-          <w:top w:space="0" w:sz="0" w:val="nil"/>
-          <w:left w:space="0" w:sz="0" w:val="nil"/>
-          <w:bottom w:space="0" w:sz="0" w:val="nil"/>
-          <w:right w:space="0" w:sz="0" w:val="nil"/>
-          <w:between w:space="0" w:sz="0" w:val="nil"/>
-        </w:pBdr>
-        <w:shd w:fill="auto" w:val="clear"/>
-        <w:spacing w:after="20" w:before="0" w:line="240" w:lineRule="auto"/>
-        <w:ind w:left="720" w:right="0" w:hanging="360"/>
-        <w:jc w:val="left"/>
-        <w:rPr>
-          <w:color w:val="000000"/>
-        </w:rPr>
-      </w:pPr>
-      <w:r>
-        <w:rPr>
-          <w:rFonts w:ascii="Inter" w:cs="Inter" w:eastAsia="Inter" w:hAnsi="Inter"/>
-          <w:b w:val="0"/>
-          <w:bCs w:val="0"/>
-          <w:i w:val="0"/>
-          <w:iCs w:val="0"/>
-          <w:smallCaps w:val="0"/>
-          <w:strike w:val="0"/>
-          <w:color w:val="000000"/>
-          <w:sz w:val="16"/>
-          <w:szCs w:val="16"/>
-          <w:u w:val="none"/>
-          <w:shd w:fill="auto" w:val="clear"/>
-          <w:vertAlign w:val="baseline"/>
-          <w:rtl w:val="0"/>
-        </w:rPr>
         <w:t xml:space="preserve">Integrated Stripe payments and NextAuth authentication via Prisma + PostgreSQL, with server-side rendering, debounced search, filtering, and infinite scrolling</w:t>
       </w:r>
     </w:p>
@@ -1627,7 +1674,7 @@
           <w:szCs w:val="18"/>
           <w:rtl w:val="0"/>
         </w:rPr>
-        <w:t xml:space="preserve">CERTIFICATIONS</w:t>
+        <w:t xml:space="preserve">CERTIFICATIONS &amp; TRAINING</w:t>
       </w:r>
       <w:r>
         <w:rPr>
@@ -1650,7 +1697,7 @@
           <w:szCs w:val="16"/>
           <w:rtl w:val="0"/>
         </w:rPr>
-        <w:t xml:space="preserve">AWS Cloud Quest: Cloud Practitioner (Jan 2026) | AWS Cloud Practitioner Essentials (Jan 2026) | PhilNITS Certified IT Professional FE (Apr 2025)</w:t>
+        <w:t xml:space="preserve">AWS Cloud Quest: Cloud Practitioner &amp; Cloud Practitioner Essentials (Jan 2026) | PhilNITS Certified IT Professional FE (Apr 2025)</w:t>
       </w:r>
       <w:r>
         <w:rPr>

</xml_diff>